<commit_message>
TS 5.4 Kramam corrections
</commit_message>
<xml_diff>
--- a/TS-Kramam/TS-5.4/TS 5.4 Tamil Krama Paatam Corrections.docx
+++ b/TS-Kramam/TS-5.4/TS 5.4 Tamil Krama Paatam Corrections.docx
@@ -3686,76 +3686,6 @@
           </w:p>
         </w:tc>
       </w:tr>
-      <w:tr>
-        <w:trPr>
-          <w:trHeight w:val="1132"/>
-        </w:trPr>
-        <w:tc>
-          <w:tcPr>
-            <w:tcW w:w="3907" w:type="dxa"/>
-          </w:tcPr>
-          <w:p>
-            <w:pPr>
-              <w:widowControl w:val="0"/>
-              <w:tabs>
-                <w:tab w:val="left" w:pos="993"/>
-              </w:tabs>
-              <w:autoSpaceDE w:val="0"/>
-              <w:autoSpaceDN w:val="0"/>
-              <w:adjustRightInd w:val="0"/>
-              <w:spacing w:before="0" w:line="240" w:lineRule="auto"/>
-              <w:ind w:right="297"/>
-              <w:rPr>
-                <w:rFonts w:cs="Arial"/>
-                <w:b/>
-                <w:color w:val="000000"/>
-                <w:sz w:val="28"/>
-                <w:szCs w:val="32"/>
-              </w:rPr>
-            </w:pPr>
-          </w:p>
-        </w:tc>
-        <w:tc>
-          <w:tcPr>
-            <w:tcW w:w="5105" w:type="dxa"/>
-          </w:tcPr>
-          <w:p>
-            <w:pPr>
-              <w:widowControl w:val="0"/>
-              <w:autoSpaceDE w:val="0"/>
-              <w:autoSpaceDN w:val="0"/>
-              <w:adjustRightInd w:val="0"/>
-              <w:spacing w:before="0" w:line="240" w:lineRule="auto"/>
-              <w:rPr>
-                <w:rFonts w:ascii="BRH Malayalam Extra" w:hAnsi="BRH Malayalam Extra" w:cs="BRH Malayalam Extra"/>
-                <w:color w:val="000000"/>
-                <w:sz w:val="36"/>
-                <w:szCs w:val="40"/>
-              </w:rPr>
-            </w:pPr>
-          </w:p>
-        </w:tc>
-        <w:tc>
-          <w:tcPr>
-            <w:tcW w:w="5388" w:type="dxa"/>
-          </w:tcPr>
-          <w:p>
-            <w:pPr>
-              <w:widowControl w:val="0"/>
-              <w:autoSpaceDE w:val="0"/>
-              <w:autoSpaceDN w:val="0"/>
-              <w:adjustRightInd w:val="0"/>
-              <w:spacing w:before="0" w:line="240" w:lineRule="auto"/>
-              <w:rPr>
-                <w:rFonts w:ascii="Cambria" w:hAnsi="Cambria" w:cs="BRH Malayalam Extra"/>
-                <w:color w:val="000000"/>
-                <w:sz w:val="36"/>
-                <w:szCs w:val="40"/>
-              </w:rPr>
-            </w:pPr>
-          </w:p>
-        </w:tc>
-      </w:tr>
     </w:tbl>
     <w:p>
       <w:pPr>
@@ -3790,42 +3720,6 @@
           <w:u w:val="single"/>
         </w:rPr>
       </w:pPr>
-    </w:p>
-    <w:p>
-      <w:pPr>
-        <w:jc w:val="center"/>
-        <w:rPr>
-          <w:b/>
-          <w:bCs/>
-          <w:sz w:val="32"/>
-          <w:szCs w:val="32"/>
-          <w:u w:val="single"/>
-        </w:rPr>
-      </w:pPr>
-    </w:p>
-    <w:p>
-      <w:pPr>
-        <w:jc w:val="center"/>
-        <w:rPr>
-          <w:b/>
-          <w:bCs/>
-          <w:sz w:val="32"/>
-          <w:szCs w:val="32"/>
-          <w:u w:val="single"/>
-        </w:rPr>
-      </w:pPr>
-    </w:p>
-    <w:p>
-      <w:pPr>
-        <w:jc w:val="center"/>
-        <w:rPr>
-          <w:b/>
-          <w:bCs/>
-          <w:sz w:val="32"/>
-          <w:szCs w:val="32"/>
-          <w:u w:val="single"/>
-        </w:rPr>
-      </w:pPr>
       <w:r>
         <w:rPr>
           <w:b/>
@@ -3834,6 +3728,7 @@
           <w:szCs w:val="32"/>
           <w:u w:val="single"/>
         </w:rPr>
+        <w:lastRenderedPageBreak/>
         <w:t xml:space="preserve">TS </w:t>
       </w:r>
       <w:r>
@@ -4781,7 +4676,6 @@
                 <w:sz w:val="28"/>
                 <w:szCs w:val="32"/>
               </w:rPr>
-              <w:lastRenderedPageBreak/>
               <w:t>T.S.5.</w:t>
             </w:r>
             <w:r>
@@ -6320,6 +6214,7 @@
                 <w:sz w:val="28"/>
                 <w:szCs w:val="32"/>
               </w:rPr>
+              <w:lastRenderedPageBreak/>
               <w:t>T.S.5.4.3.3 – Kramam</w:t>
             </w:r>
           </w:p>
@@ -8695,7 +8590,6 @@
                 <w:sz w:val="28"/>
                 <w:szCs w:val="32"/>
               </w:rPr>
-              <w:lastRenderedPageBreak/>
               <w:t>T.S.5.4.5.2 – Kramam</w:t>
             </w:r>
           </w:p>
@@ -10213,6 +10107,7 @@
                 <w:sz w:val="28"/>
                 <w:szCs w:val="32"/>
               </w:rPr>
+              <w:lastRenderedPageBreak/>
               <w:t>T.S.5.4.6.6 – Kramam</w:t>
             </w:r>
           </w:p>
@@ -12400,7 +12295,6 @@
                 <w:sz w:val="28"/>
                 <w:szCs w:val="32"/>
               </w:rPr>
-              <w:lastRenderedPageBreak/>
               <w:t>T.S.5.</w:t>
             </w:r>
             <w:r>
@@ -14276,6 +14170,7 @@
                 <w:sz w:val="28"/>
                 <w:szCs w:val="32"/>
               </w:rPr>
+              <w:lastRenderedPageBreak/>
               <w:t>T.S.5.</w:t>
             </w:r>
             <w:r>
@@ -15294,7 +15189,6 @@
                 <w:sz w:val="32"/>
                 <w:szCs w:val="36"/>
               </w:rPr>
-              <w:lastRenderedPageBreak/>
               <w:t>None</w:t>
             </w:r>
           </w:p>

</xml_diff>

<commit_message>
TS 5.4- 5.7 Tamil Kramam final pushed
</commit_message>
<xml_diff>
--- a/TS-Kramam/TS-5.4/TS 5.4 Tamil Krama Paatam Corrections.docx
+++ b/TS-Kramam/TS-5.4/TS 5.4 Tamil Krama Paatam Corrections.docx
@@ -89,10 +89,9 @@
           <w:bCs/>
           <w:sz w:val="32"/>
           <w:szCs w:val="32"/>
-          <w:highlight w:val="red"/>
           <w:u w:val="single"/>
         </w:rPr>
-        <w:t>?????</w:t>
+        <w:t>31st July 2026</w:t>
       </w:r>
     </w:p>
     <w:p>
@@ -14802,7 +14801,16 @@
           <w:bCs/>
           <w:sz w:val="32"/>
         </w:rPr>
-        <w:t>replaced with</w:t>
+        <w:t xml:space="preserve">replaced </w:t>
+      </w:r>
+      <w:proofErr w:type="gramStart"/>
+      <w:r>
+        <w:rPr>
+          <w:b/>
+          <w:bCs/>
+          <w:sz w:val="32"/>
+        </w:rPr>
+        <w:t>with</w:t>
       </w:r>
       <w:r>
         <w:rPr>
@@ -14824,6 +14832,7 @@
         </w:rPr>
         <w:t>"</w:t>
       </w:r>
+      <w:proofErr w:type="gramEnd"/>
       <w:r>
         <w:rPr>
           <w:rFonts w:ascii="Latha" w:hAnsi="Latha" w:cs="Latha"/>

</xml_diff>